<commit_message>
Résumé: make contact and project links clickable
Email, phone, LinkedIn, GitHub, portfolio and the project titles link out in
both the PDF and the Word copy.

Co-Authored-By: Claude Sonnet 5.5 <noreply@anthropic.com>
</commit_message>
<xml_diff>
--- a/assets/Purushottam_Kumar_Sahni_Resume.docx
+++ b/assets/Purushottam_Kumar_Sahni_Resume.docx
@@ -20,32 +20,94 @@
       </w:pPr>
       <w:r>
         <w:rPr>
-          <w:b w:val="0"/>
           <w:sz w:val="19"/>
         </w:rPr>
-        <w:t>Noida, India (open to relocation)  |  purushottamsahni07@gmail.com  |  +91 7023942720</w:t>
+        <w:t>Noida, India (open to relocation)</w:t>
       </w:r>
+      <w:r>
+        <w:rPr>
+          <w:sz w:val="19"/>
+        </w:rPr>
+        <w:t xml:space="preserve">  |  </w:t>
+      </w:r>
+      <w:hyperlink r:id="rId9">
+        <w:r>
+          <w:rPr>
+            <w:color w:val="0B4F8A"/>
+            <w:u w:val="single"/>
+            <w:sz w:val="19"/>
+          </w:rPr>
+          <w:t xml:space="preserve">purushottamsahni07@gmail.com</w:t>
+        </w:r>
+      </w:hyperlink>
+      <w:r>
+        <w:rPr>
+          <w:sz w:val="19"/>
+        </w:rPr>
+        <w:t xml:space="preserve">  |  </w:t>
+      </w:r>
+      <w:hyperlink r:id="rId10">
+        <w:r>
+          <w:rPr>
+            <w:color w:val="0B4F8A"/>
+            <w:u w:val="single"/>
+            <w:sz w:val="19"/>
+          </w:rPr>
+          <w:t xml:space="preserve">+91 7023942720</w:t>
+        </w:r>
+      </w:hyperlink>
     </w:p>
     <w:p>
       <w:pPr>
         <w:spacing w:after="0"/>
       </w:pPr>
+      <w:hyperlink r:id="rId11">
+        <w:r>
+          <w:rPr>
+            <w:color w:val="0B4F8A"/>
+            <w:u w:val="single"/>
+            <w:sz w:val="19"/>
+          </w:rPr>
+          <w:t xml:space="preserve">linkedin.com/in/dataanalystpurushottam-sahni</w:t>
+        </w:r>
+      </w:hyperlink>
       <w:r>
         <w:rPr>
-          <w:b w:val="0"/>
           <w:sz w:val="19"/>
         </w:rPr>
-        <w:t>linkedin.com/in/dataanalystpurushottam-sahni  |  github.com/PurushottamSahni</w:t>
+        <w:t xml:space="preserve">  |  </w:t>
       </w:r>
+      <w:hyperlink r:id="rId12">
+        <w:r>
+          <w:rPr>
+            <w:color w:val="0B4F8A"/>
+            <w:u w:val="single"/>
+            <w:sz w:val="19"/>
+          </w:rPr>
+          <w:t xml:space="preserve">github.com/PurushottamSahni</w:t>
+        </w:r>
+      </w:hyperlink>
     </w:p>
     <w:p>
+      <w:pPr>
+        <w:spacing w:after="40"/>
+      </w:pPr>
       <w:r>
         <w:rPr>
-          <w:b w:val="0"/>
           <w:sz w:val="19"/>
         </w:rPr>
-        <w:t>Portfolio: purushottamsahni.github.io/Purushottam_Sahni_Portfolio</w:t>
+        <w:t xml:space="preserve">Portfolio: </w:t>
       </w:r>
+      <w:hyperlink r:id="rId13">
+        <w:r>
+          <w:rPr>
+            <w:color w:val="0B4F8A"/>
+            <w:u w:val="single"/>
+            <w:sz w:val="19"/>
+          </w:rPr>
+          <w:t xml:space="preserve">purushottamsahni.github.io/Purushottam_Sahni_Portfolio</w:t>
+        </w:r>
+      </w:hyperlink>
     </w:p>
     <w:p>
       <w:pPr>
@@ -243,16 +305,23 @@
       <w:pPr>
         <w:pStyle w:val="ListBullet"/>
       </w:pPr>
+      <w:hyperlink r:id="rId14">
+        <w:r>
+          <w:rPr>
+            <w:color w:val="0B4F8A"/>
+            <w:u w:val="single"/>
+            <w:b/>
+          </w:rPr>
+          <w:t xml:space="preserve">Product Sentinel, AI product analyst (solo, hackathon, 2026)</w:t>
+        </w:r>
+      </w:hyperlink>
       <w:r>
         <w:rPr>
           <w:b/>
         </w:rPr>
-        <w:t xml:space="preserve">Product Sentinel, AI product analyst (solo, hackathon, 2026): </w:t>
+        <w:t xml:space="preserve">: </w:t>
       </w:r>
       <w:r>
-        <w:rPr>
-          <w:b w:val="0"/>
-        </w:rPr>
         <w:t>Agent that watches funnel metrics, finds the root cause, and sends Slack alerts and Jira tickets, asking a human before irreversible steps. FastAPI, React, BigQuery, Vertex AI. 11 of 11 automated tests pass.</w:t>
       </w:r>
     </w:p>
@@ -260,16 +329,23 @@
       <w:pPr>
         <w:pStyle w:val="ListBullet"/>
       </w:pPr>
+      <w:hyperlink r:id="rId15">
+        <w:r>
+          <w:rPr>
+            <w:color w:val="0B4F8A"/>
+            <w:u w:val="single"/>
+            <w:b/>
+          </w:rPr>
+          <w:t xml:space="preserve">Paris 2024 Olympics Dashboard (Power BI, DAX, Power Query)</w:t>
+        </w:r>
+      </w:hyperlink>
       <w:r>
         <w:rPr>
           <w:b/>
         </w:rPr>
-        <w:t xml:space="preserve">Paris 2024 Olympics Dashboard (Power BI, DAX, Power Query): </w:t>
+        <w:t xml:space="preserve">: </w:t>
       </w:r>
       <w:r>
-        <w:rPr>
-          <w:b w:val="0"/>
-        </w:rPr>
         <w:t>11,113 athletes and 92 medal-winning countries; medals by country and gender.</w:t>
       </w:r>
     </w:p>
@@ -277,16 +353,23 @@
       <w:pPr>
         <w:pStyle w:val="ListBullet"/>
       </w:pPr>
+      <w:hyperlink r:id="rId16">
+        <w:r>
+          <w:rPr>
+            <w:color w:val="0B4F8A"/>
+            <w:u w:val="single"/>
+            <w:b/>
+          </w:rPr>
+          <w:t xml:space="preserve">Weekly Credit Card Analysis (Power BI, DAX)</w:t>
+        </w:r>
+      </w:hyperlink>
       <w:r>
         <w:rPr>
           <w:b/>
         </w:rPr>
-        <w:t xml:space="preserve">Weekly Credit Card Analysis (Power BI, DAX): </w:t>
+        <w:t xml:space="preserve">: </w:t>
       </w:r>
       <w:r>
-        <w:rPr>
-          <w:b w:val="0"/>
-        </w:rPr>
         <w:t>Weekly and quarterly view of revenue (57M across 667K transactions), interest and customer segments.</w:t>
       </w:r>
     </w:p>
@@ -298,12 +381,15 @@
         <w:rPr>
           <w:b/>
         </w:rPr>
-        <w:t xml:space="preserve">Maven UK Train Analysis (Power BI, MySQL, DAX): </w:t>
+        <w:t>Maven UK Train Analysis (Power BI, MySQL, DAX)</w:t>
       </w:r>
       <w:r>
         <w:rPr>
-          <w:b w:val="0"/>
+          <w:b/>
         </w:rPr>
+        <w:t xml:space="preserve">: </w:t>
+      </w:r>
+      <w:r>
         <w:t>86.8% of journeys on time; €649.3K revenue and €92.6K refunded.</w:t>
       </w:r>
     </w:p>
@@ -311,16 +397,23 @@
       <w:pPr>
         <w:pStyle w:val="ListBullet"/>
       </w:pPr>
+      <w:hyperlink r:id="rId17">
+        <w:r>
+          <w:rPr>
+            <w:color w:val="0B4F8A"/>
+            <w:u w:val="single"/>
+            <w:b/>
+          </w:rPr>
+          <w:t xml:space="preserve">Blinkit Sales Dashboard (Power BI)</w:t>
+        </w:r>
+      </w:hyperlink>
       <w:r>
         <w:rPr>
           <w:b/>
         </w:rPr>
-        <w:t xml:space="preserve">Blinkit Sales Dashboard (Power BI): </w:t>
+        <w:t xml:space="preserve">: </w:t>
       </w:r>
       <w:r>
-        <w:rPr>
-          <w:b w:val="0"/>
-        </w:rPr>
         <w:t>₹1.20M sales across 8,523 items, by outlet type, size and location.</w:t>
       </w:r>
     </w:p>
@@ -328,16 +421,23 @@
       <w:pPr>
         <w:pStyle w:val="ListBullet"/>
       </w:pPr>
+      <w:hyperlink r:id="rId18">
+        <w:r>
+          <w:rPr>
+            <w:color w:val="0B4F8A"/>
+            <w:u w:val="single"/>
+            <w:b/>
+          </w:rPr>
+          <w:t xml:space="preserve">Profit Analysis (Looker Studio, Google Sheets)</w:t>
+        </w:r>
+      </w:hyperlink>
       <w:r>
         <w:rPr>
           <w:b/>
         </w:rPr>
-        <w:t xml:space="preserve">Profit Analysis (Looker Studio, Google Sheets): </w:t>
+        <w:t xml:space="preserve">: </w:t>
       </w:r>
       <w:r>
-        <w:rPr>
-          <w:b w:val="0"/>
-        </w:rPr>
         <w:t>$55.4M sales and $31.6M profit; online sales led at $27.2M.</w:t>
       </w:r>
     </w:p>

</xml_diff>

<commit_message>
Résumé: add visible 'Project link' labels and merge link areas
Each project now ends its title with a clickable 'Project link', like the
earlier résumé. Link areas are merged to one per link for simpler PDF viewers.

Co-Authored-By: Claude Sonnet 5.5 <noreply@anthropic.com>
</commit_message>
<xml_diff>
--- a/assets/Purushottam_Kumar_Sahni_Resume.docx
+++ b/assets/Purushottam_Kumar_Sahni_Resume.docx
@@ -305,16 +305,27 @@
       <w:pPr>
         <w:pStyle w:val="ListBullet"/>
       </w:pPr>
+      <w:r>
+        <w:rPr>
+          <w:b/>
+        </w:rPr>
+        <w:t>Product Sentinel, AI product analyst (solo, hackathon, 2026)</w:t>
+      </w:r>
+      <w:r>
+        <w:t xml:space="preserve"> (</w:t>
+      </w:r>
       <w:hyperlink r:id="rId14">
         <w:r>
           <w:rPr>
             <w:color w:val="0B4F8A"/>
             <w:u w:val="single"/>
-            <w:b/>
           </w:rPr>
-          <w:t xml:space="preserve">Product Sentinel, AI product analyst (solo, hackathon, 2026)</w:t>
+          <w:t xml:space="preserve">Project link</w:t>
         </w:r>
       </w:hyperlink>
+      <w:r>
+        <w:t>)</w:t>
+      </w:r>
       <w:r>
         <w:rPr>
           <w:b/>
@@ -329,16 +340,27 @@
       <w:pPr>
         <w:pStyle w:val="ListBullet"/>
       </w:pPr>
+      <w:r>
+        <w:rPr>
+          <w:b/>
+        </w:rPr>
+        <w:t>Paris 2024 Olympics Dashboard (Power BI, DAX, Power Query)</w:t>
+      </w:r>
+      <w:r>
+        <w:t xml:space="preserve"> (</w:t>
+      </w:r>
       <w:hyperlink r:id="rId15">
         <w:r>
           <w:rPr>
             <w:color w:val="0B4F8A"/>
             <w:u w:val="single"/>
-            <w:b/>
           </w:rPr>
-          <w:t xml:space="preserve">Paris 2024 Olympics Dashboard (Power BI, DAX, Power Query)</w:t>
+          <w:t xml:space="preserve">Project link</w:t>
         </w:r>
       </w:hyperlink>
+      <w:r>
+        <w:t>)</w:t>
+      </w:r>
       <w:r>
         <w:rPr>
           <w:b/>
@@ -353,16 +375,27 @@
       <w:pPr>
         <w:pStyle w:val="ListBullet"/>
       </w:pPr>
+      <w:r>
+        <w:rPr>
+          <w:b/>
+        </w:rPr>
+        <w:t>Weekly Credit Card Analysis (Power BI, DAX)</w:t>
+      </w:r>
+      <w:r>
+        <w:t xml:space="preserve"> (</w:t>
+      </w:r>
       <w:hyperlink r:id="rId16">
         <w:r>
           <w:rPr>
             <w:color w:val="0B4F8A"/>
             <w:u w:val="single"/>
-            <w:b/>
           </w:rPr>
-          <w:t xml:space="preserve">Weekly Credit Card Analysis (Power BI, DAX)</w:t>
+          <w:t xml:space="preserve">Project link</w:t>
         </w:r>
       </w:hyperlink>
+      <w:r>
+        <w:t>)</w:t>
+      </w:r>
       <w:r>
         <w:rPr>
           <w:b/>
@@ -397,16 +430,27 @@
       <w:pPr>
         <w:pStyle w:val="ListBullet"/>
       </w:pPr>
+      <w:r>
+        <w:rPr>
+          <w:b/>
+        </w:rPr>
+        <w:t>Blinkit Sales Dashboard (Power BI)</w:t>
+      </w:r>
+      <w:r>
+        <w:t xml:space="preserve"> (</w:t>
+      </w:r>
       <w:hyperlink r:id="rId17">
         <w:r>
           <w:rPr>
             <w:color w:val="0B4F8A"/>
             <w:u w:val="single"/>
-            <w:b/>
           </w:rPr>
-          <w:t xml:space="preserve">Blinkit Sales Dashboard (Power BI)</w:t>
+          <w:t xml:space="preserve">Project link</w:t>
         </w:r>
       </w:hyperlink>
+      <w:r>
+        <w:t>)</w:t>
+      </w:r>
       <w:r>
         <w:rPr>
           <w:b/>
@@ -421,16 +465,27 @@
       <w:pPr>
         <w:pStyle w:val="ListBullet"/>
       </w:pPr>
+      <w:r>
+        <w:rPr>
+          <w:b/>
+        </w:rPr>
+        <w:t>Profit Analysis (Looker Studio, Google Sheets)</w:t>
+      </w:r>
+      <w:r>
+        <w:t xml:space="preserve"> (</w:t>
+      </w:r>
       <w:hyperlink r:id="rId18">
         <w:r>
           <w:rPr>
             <w:color w:val="0B4F8A"/>
             <w:u w:val="single"/>
-            <w:b/>
           </w:rPr>
-          <w:t xml:space="preserve">Profit Analysis (Looker Studio, Google Sheets)</w:t>
+          <w:t xml:space="preserve">Project link</w:t>
         </w:r>
       </w:hyperlink>
+      <w:r>
+        <w:t>)</w:t>
+      </w:r>
       <w:r>
         <w:rPr>
           <w:b/>

</xml_diff>

<commit_message>
Résumé: add the Maven UK Train LinkedIn post link
Co-Authored-By: Claude Sonnet 5.5 <noreply@anthropic.com>
</commit_message>
<xml_diff>
--- a/assets/Purushottam_Kumar_Sahni_Resume.docx
+++ b/assets/Purushottam_Kumar_Sahni_Resume.docx
@@ -417,6 +417,21 @@
         <w:t>Maven UK Train Analysis (Power BI, MySQL, DAX)</w:t>
       </w:r>
       <w:r>
+        <w:t xml:space="preserve"> (</w:t>
+      </w:r>
+      <w:hyperlink r:id="rId17">
+        <w:r>
+          <w:rPr>
+            <w:color w:val="0B4F8A"/>
+            <w:u w:val="single"/>
+          </w:rPr>
+          <w:t xml:space="preserve">Project link</w:t>
+        </w:r>
+      </w:hyperlink>
+      <w:r>
+        <w:t>)</w:t>
+      </w:r>
+      <w:r>
         <w:rPr>
           <w:b/>
         </w:rPr>
@@ -439,7 +454,7 @@
       <w:r>
         <w:t xml:space="preserve"> (</w:t>
       </w:r>
-      <w:hyperlink r:id="rId17">
+      <w:hyperlink r:id="rId18">
         <w:r>
           <w:rPr>
             <w:color w:val="0B4F8A"/>
@@ -474,7 +489,7 @@
       <w:r>
         <w:t xml:space="preserve"> (</w:t>
       </w:r>
-      <w:hyperlink r:id="rId18">
+      <w:hyperlink r:id="rId19">
         <w:r>
           <w:rPr>
             <w:color w:val="0B4F8A"/>

</xml_diff>

<commit_message>
Résumé: short link labels on one line
LinkedIn, GitHub and Portfolio now show as short labels on a single line, each
linking to the full address, in both the PDF and the Word copy.

Co-Authored-By: Claude Sonnet 5.5 <noreply@anthropic.com>
</commit_message>
<xml_diff>
--- a/assets/Purushottam_Kumar_Sahni_Resume.docx
+++ b/assets/Purushottam_Kumar_Sahni_Resume.docx
@@ -59,7 +59,7 @@
     </w:p>
     <w:p>
       <w:pPr>
-        <w:spacing w:after="0"/>
+        <w:spacing w:after="40"/>
       </w:pPr>
       <w:hyperlink r:id="rId11">
         <w:r>
@@ -68,7 +68,7 @@
             <w:u w:val="single"/>
             <w:sz w:val="19"/>
           </w:rPr>
-          <w:t xml:space="preserve">linkedin.com/in/dataanalystpurushottam-sahni</w:t>
+          <w:t xml:space="preserve">LinkedIn/purushottam-sahni</w:t>
         </w:r>
       </w:hyperlink>
       <w:r>
@@ -84,19 +84,14 @@
             <w:u w:val="single"/>
             <w:sz w:val="19"/>
           </w:rPr>
-          <w:t xml:space="preserve">github.com/PurushottamSahni</w:t>
+          <w:t xml:space="preserve">GitHub/PurushottamSahni</w:t>
         </w:r>
       </w:hyperlink>
-    </w:p>
-    <w:p>
-      <w:pPr>
-        <w:spacing w:after="40"/>
-      </w:pPr>
       <w:r>
         <w:rPr>
           <w:sz w:val="19"/>
         </w:rPr>
-        <w:t xml:space="preserve">Portfolio: </w:t>
+        <w:t xml:space="preserve">  |  </w:t>
       </w:r>
       <w:hyperlink r:id="rId13">
         <w:r>
@@ -105,7 +100,7 @@
             <w:u w:val="single"/>
             <w:sz w:val="19"/>
           </w:rPr>
-          <w:t xml:space="preserve">purushottamsahni.github.io/Purushottam_Sahni_Portfolio</w:t>
+          <w:t xml:space="preserve">Portfolio/PurushottamSahni</w:t>
         </w:r>
       </w:hyperlink>
     </w:p>

</xml_diff>